<commit_message>
Genericize codebase for open-source distribution
- Externalize project config to projects.json (gitignored)
- Derive PROJECT_NAMES from projects.json at startup
- Add AGENT_BRAIN_PROJECT_DIR constant derived from cwd
- Replace all hardcoded user paths with dynamic values
- Add .env.example and projects.example.json templates
- Update .gitignore to exclude user-specific config

Breaking changes: None - existing behavior preserved for configured projects

Co-Authored-By: Claude Opus 4.5 <noreply@anthropic.com>
</commit_message>
<xml_diff>
--- a/Q&A on Agent Brain Pivot.docx
+++ b/Q&A on Agent Brain Pivot.docx
@@ -4,12 +4,1014 @@
   <w:body>
     <w:p>
       <w:pPr>
-        <w:pStyle w:val="p1"/>
+        <w:pBdr>
+          <w:top w:val="single" w:sz="2" w:space="0" w:color="1F1E1D"/>
+          <w:left w:val="single" w:sz="2" w:space="0" w:color="1F1E1D"/>
+          <w:bottom w:val="single" w:sz="2" w:space="0" w:color="1F1E1D"/>
+          <w:right w:val="single" w:sz="2" w:space="0" w:color="1F1E1D"/>
+        </w:pBdr>
+        <w:tabs>
+          <w:tab w:val="left" w:pos="916"/>
+          <w:tab w:val="left" w:pos="1832"/>
+          <w:tab w:val="left" w:pos="2748"/>
+          <w:tab w:val="left" w:pos="3664"/>
+          <w:tab w:val="left" w:pos="4580"/>
+          <w:tab w:val="left" w:pos="5496"/>
+          <w:tab w:val="left" w:pos="6412"/>
+          <w:tab w:val="left" w:pos="7328"/>
+          <w:tab w:val="left" w:pos="8244"/>
+          <w:tab w:val="left" w:pos="9160"/>
+          <w:tab w:val="left" w:pos="10076"/>
+          <w:tab w:val="left" w:pos="10992"/>
+          <w:tab w:val="left" w:pos="11908"/>
+          <w:tab w:val="left" w:pos="12824"/>
+          <w:tab w:val="left" w:pos="13740"/>
+          <w:tab w:val="left" w:pos="14656"/>
+        </w:tabs>
+        <w:spacing w:after="0" w:line="240" w:lineRule="auto"/>
+        <w:rPr>
+          <w:rFonts w:ascii="Menlo" w:eastAsia="Times New Roman" w:hAnsi="Menlo" w:cs="Menlo"/>
+          <w:color w:val="14181F"/>
+          <w:kern w:val="0"/>
+          <w:sz w:val="20"/>
+          <w:szCs w:val="20"/>
+          <w:bdr w:val="single" w:sz="2" w:space="0" w:color="1F1E1D" w:frame="1"/>
+          <w14:ligatures w14:val="none"/>
+        </w:rPr>
+      </w:pPr>
+      <w:r>
+        <w:rPr>
+          <w:rFonts w:ascii="Menlo" w:eastAsia="Times New Roman" w:hAnsi="Menlo" w:cs="Menlo"/>
+          <w:color w:val="14181F"/>
+          <w:kern w:val="0"/>
+          <w:sz w:val="20"/>
+          <w:szCs w:val="20"/>
+          <w:bdr w:val="single" w:sz="2" w:space="0" w:color="1F1E1D" w:frame="1"/>
+          <w14:ligatures w14:val="none"/>
+        </w:rPr>
+        <w:t>Agent Brain has a new checkpoint system for getting my approval. When you need my input before proceeding (plan approval, design decisions, questions), use this instead of just asking in the chat — I can respond from my phone even when I'm away.</w:t>
+      </w:r>
+    </w:p>
+    <w:p>
+      <w:pPr>
+        <w:pBdr>
+          <w:top w:val="single" w:sz="2" w:space="0" w:color="1F1E1D"/>
+          <w:left w:val="single" w:sz="2" w:space="0" w:color="1F1E1D"/>
+          <w:bottom w:val="single" w:sz="2" w:space="0" w:color="1F1E1D"/>
+          <w:right w:val="single" w:sz="2" w:space="0" w:color="1F1E1D"/>
+        </w:pBdr>
+        <w:tabs>
+          <w:tab w:val="left" w:pos="916"/>
+          <w:tab w:val="left" w:pos="1832"/>
+          <w:tab w:val="left" w:pos="2748"/>
+          <w:tab w:val="left" w:pos="3664"/>
+          <w:tab w:val="left" w:pos="4580"/>
+          <w:tab w:val="left" w:pos="5496"/>
+          <w:tab w:val="left" w:pos="6412"/>
+          <w:tab w:val="left" w:pos="7328"/>
+          <w:tab w:val="left" w:pos="8244"/>
+          <w:tab w:val="left" w:pos="9160"/>
+          <w:tab w:val="left" w:pos="10076"/>
+          <w:tab w:val="left" w:pos="10992"/>
+          <w:tab w:val="left" w:pos="11908"/>
+          <w:tab w:val="left" w:pos="12824"/>
+          <w:tab w:val="left" w:pos="13740"/>
+          <w:tab w:val="left" w:pos="14656"/>
+        </w:tabs>
+        <w:spacing w:after="0" w:line="240" w:lineRule="auto"/>
+        <w:rPr>
+          <w:rFonts w:ascii="Menlo" w:eastAsia="Times New Roman" w:hAnsi="Menlo" w:cs="Menlo"/>
+          <w:color w:val="14181F"/>
+          <w:kern w:val="0"/>
+          <w:sz w:val="20"/>
+          <w:szCs w:val="20"/>
+          <w:bdr w:val="single" w:sz="2" w:space="0" w:color="1F1E1D" w:frame="1"/>
+          <w14:ligatures w14:val="none"/>
+        </w:rPr>
+      </w:pPr>
+    </w:p>
+    <w:p>
+      <w:pPr>
+        <w:pBdr>
+          <w:top w:val="single" w:sz="2" w:space="0" w:color="1F1E1D"/>
+          <w:left w:val="single" w:sz="2" w:space="0" w:color="1F1E1D"/>
+          <w:bottom w:val="single" w:sz="2" w:space="0" w:color="1F1E1D"/>
+          <w:right w:val="single" w:sz="2" w:space="0" w:color="1F1E1D"/>
+        </w:pBdr>
+        <w:tabs>
+          <w:tab w:val="left" w:pos="916"/>
+          <w:tab w:val="left" w:pos="1832"/>
+          <w:tab w:val="left" w:pos="2748"/>
+          <w:tab w:val="left" w:pos="3664"/>
+          <w:tab w:val="left" w:pos="4580"/>
+          <w:tab w:val="left" w:pos="5496"/>
+          <w:tab w:val="left" w:pos="6412"/>
+          <w:tab w:val="left" w:pos="7328"/>
+          <w:tab w:val="left" w:pos="8244"/>
+          <w:tab w:val="left" w:pos="9160"/>
+          <w:tab w:val="left" w:pos="10076"/>
+          <w:tab w:val="left" w:pos="10992"/>
+          <w:tab w:val="left" w:pos="11908"/>
+          <w:tab w:val="left" w:pos="12824"/>
+          <w:tab w:val="left" w:pos="13740"/>
+          <w:tab w:val="left" w:pos="14656"/>
+        </w:tabs>
+        <w:spacing w:after="0" w:line="240" w:lineRule="auto"/>
+        <w:rPr>
+          <w:rFonts w:ascii="Menlo" w:eastAsia="Times New Roman" w:hAnsi="Menlo" w:cs="Menlo"/>
+          <w:color w:val="14181F"/>
+          <w:kern w:val="0"/>
+          <w:sz w:val="20"/>
+          <w:szCs w:val="20"/>
+          <w:bdr w:val="single" w:sz="2" w:space="0" w:color="1F1E1D" w:frame="1"/>
+          <w14:ligatures w14:val="none"/>
+        </w:rPr>
+      </w:pPr>
+      <w:r>
+        <w:rPr>
+          <w:rFonts w:ascii="Menlo" w:eastAsia="Times New Roman" w:hAnsi="Menlo" w:cs="Menlo"/>
+          <w:color w:val="14181F"/>
+          <w:kern w:val="0"/>
+          <w:sz w:val="20"/>
+          <w:szCs w:val="20"/>
+          <w:bdr w:val="single" w:sz="2" w:space="0" w:color="1F1E1D" w:frame="1"/>
+          <w14:ligatures w14:val="none"/>
+        </w:rPr>
+        <w:t>Run this bash command when you need my approval:</w:t>
+      </w:r>
+    </w:p>
+    <w:p>
+      <w:pPr>
+        <w:pBdr>
+          <w:top w:val="single" w:sz="2" w:space="0" w:color="1F1E1D"/>
+          <w:left w:val="single" w:sz="2" w:space="0" w:color="1F1E1D"/>
+          <w:bottom w:val="single" w:sz="2" w:space="0" w:color="1F1E1D"/>
+          <w:right w:val="single" w:sz="2" w:space="0" w:color="1F1E1D"/>
+        </w:pBdr>
+        <w:tabs>
+          <w:tab w:val="left" w:pos="916"/>
+          <w:tab w:val="left" w:pos="1832"/>
+          <w:tab w:val="left" w:pos="2748"/>
+          <w:tab w:val="left" w:pos="3664"/>
+          <w:tab w:val="left" w:pos="4580"/>
+          <w:tab w:val="left" w:pos="5496"/>
+          <w:tab w:val="left" w:pos="6412"/>
+          <w:tab w:val="left" w:pos="7328"/>
+          <w:tab w:val="left" w:pos="8244"/>
+          <w:tab w:val="left" w:pos="9160"/>
+          <w:tab w:val="left" w:pos="10076"/>
+          <w:tab w:val="left" w:pos="10992"/>
+          <w:tab w:val="left" w:pos="11908"/>
+          <w:tab w:val="left" w:pos="12824"/>
+          <w:tab w:val="left" w:pos="13740"/>
+          <w:tab w:val="left" w:pos="14656"/>
+        </w:tabs>
+        <w:spacing w:after="0" w:line="240" w:lineRule="auto"/>
+        <w:rPr>
+          <w:rFonts w:ascii="Menlo" w:eastAsia="Times New Roman" w:hAnsi="Menlo" w:cs="Menlo"/>
+          <w:color w:val="14181F"/>
+          <w:kern w:val="0"/>
+          <w:sz w:val="20"/>
+          <w:szCs w:val="20"/>
+          <w:bdr w:val="single" w:sz="2" w:space="0" w:color="1F1E1D" w:frame="1"/>
+          <w14:ligatures w14:val="none"/>
+        </w:rPr>
+      </w:pPr>
+    </w:p>
+    <w:p>
+      <w:pPr>
+        <w:pBdr>
+          <w:top w:val="single" w:sz="2" w:space="0" w:color="1F1E1D"/>
+          <w:left w:val="single" w:sz="2" w:space="0" w:color="1F1E1D"/>
+          <w:bottom w:val="single" w:sz="2" w:space="0" w:color="1F1E1D"/>
+          <w:right w:val="single" w:sz="2" w:space="0" w:color="1F1E1D"/>
+        </w:pBdr>
+        <w:tabs>
+          <w:tab w:val="left" w:pos="916"/>
+          <w:tab w:val="left" w:pos="1832"/>
+          <w:tab w:val="left" w:pos="2748"/>
+          <w:tab w:val="left" w:pos="3664"/>
+          <w:tab w:val="left" w:pos="4580"/>
+          <w:tab w:val="left" w:pos="5496"/>
+          <w:tab w:val="left" w:pos="6412"/>
+          <w:tab w:val="left" w:pos="7328"/>
+          <w:tab w:val="left" w:pos="8244"/>
+          <w:tab w:val="left" w:pos="9160"/>
+          <w:tab w:val="left" w:pos="10076"/>
+          <w:tab w:val="left" w:pos="10992"/>
+          <w:tab w:val="left" w:pos="11908"/>
+          <w:tab w:val="left" w:pos="12824"/>
+          <w:tab w:val="left" w:pos="13740"/>
+          <w:tab w:val="left" w:pos="14656"/>
+        </w:tabs>
+        <w:spacing w:after="0" w:line="240" w:lineRule="auto"/>
+        <w:rPr>
+          <w:rFonts w:ascii="Menlo" w:eastAsia="Times New Roman" w:hAnsi="Menlo" w:cs="Menlo"/>
+          <w:color w:val="14181F"/>
+          <w:kern w:val="0"/>
+          <w:sz w:val="20"/>
+          <w:szCs w:val="20"/>
+          <w:bdr w:val="single" w:sz="2" w:space="0" w:color="1F1E1D" w:frame="1"/>
+          <w14:ligatures w14:val="none"/>
+        </w:rPr>
+      </w:pPr>
+      <w:r>
+        <w:rPr>
+          <w:rFonts w:ascii="Menlo" w:eastAsia="Times New Roman" w:hAnsi="Menlo" w:cs="Menlo"/>
+          <w:color w:val="14181F"/>
+          <w:kern w:val="0"/>
+          <w:sz w:val="20"/>
+          <w:szCs w:val="20"/>
+          <w:bdr w:val="single" w:sz="2" w:space="0" w:color="1F1E1D" w:frame="1"/>
+          <w14:ligatures w14:val="none"/>
+        </w:rPr>
+        <w:t>```bash</w:t>
+      </w:r>
+    </w:p>
+    <w:p>
+      <w:pPr>
+        <w:pBdr>
+          <w:top w:val="single" w:sz="2" w:space="0" w:color="1F1E1D"/>
+          <w:left w:val="single" w:sz="2" w:space="0" w:color="1F1E1D"/>
+          <w:bottom w:val="single" w:sz="2" w:space="0" w:color="1F1E1D"/>
+          <w:right w:val="single" w:sz="2" w:space="0" w:color="1F1E1D"/>
+        </w:pBdr>
+        <w:tabs>
+          <w:tab w:val="left" w:pos="916"/>
+          <w:tab w:val="left" w:pos="1832"/>
+          <w:tab w:val="left" w:pos="2748"/>
+          <w:tab w:val="left" w:pos="3664"/>
+          <w:tab w:val="left" w:pos="4580"/>
+          <w:tab w:val="left" w:pos="5496"/>
+          <w:tab w:val="left" w:pos="6412"/>
+          <w:tab w:val="left" w:pos="7328"/>
+          <w:tab w:val="left" w:pos="8244"/>
+          <w:tab w:val="left" w:pos="9160"/>
+          <w:tab w:val="left" w:pos="10076"/>
+          <w:tab w:val="left" w:pos="10992"/>
+          <w:tab w:val="left" w:pos="11908"/>
+          <w:tab w:val="left" w:pos="12824"/>
+          <w:tab w:val="left" w:pos="13740"/>
+          <w:tab w:val="left" w:pos="14656"/>
+        </w:tabs>
+        <w:spacing w:after="0" w:line="240" w:lineRule="auto"/>
+        <w:rPr>
+          <w:rFonts w:ascii="Menlo" w:eastAsia="Times New Roman" w:hAnsi="Menlo" w:cs="Menlo"/>
+          <w:color w:val="14181F"/>
+          <w:kern w:val="0"/>
+          <w:sz w:val="20"/>
+          <w:szCs w:val="20"/>
+          <w:bdr w:val="single" w:sz="2" w:space="0" w:color="1F1E1D" w:frame="1"/>
+          <w14:ligatures w14:val="none"/>
+        </w:rPr>
+      </w:pPr>
+      <w:r>
+        <w:rPr>
+          <w:rFonts w:ascii="Menlo" w:eastAsia="Times New Roman" w:hAnsi="Menlo" w:cs="Menlo"/>
+          <w:color w:val="14181F"/>
+          <w:kern w:val="0"/>
+          <w:sz w:val="20"/>
+          <w:szCs w:val="20"/>
+          <w:bdr w:val="single" w:sz="2" w:space="0" w:color="1F1E1D" w:frame="1"/>
+          <w14:ligatures w14:val="none"/>
+        </w:rPr>
+        <w:t>PROJECT_KEY=$(</w:t>
+      </w:r>
+      <w:proofErr w:type="spellStart"/>
+      <w:r>
+        <w:rPr>
+          <w:rFonts w:ascii="Menlo" w:eastAsia="Times New Roman" w:hAnsi="Menlo" w:cs="Menlo"/>
+          <w:color w:val="14181F"/>
+          <w:kern w:val="0"/>
+          <w:sz w:val="20"/>
+          <w:szCs w:val="20"/>
+          <w:bdr w:val="single" w:sz="2" w:space="0" w:color="1F1E1D" w:frame="1"/>
+          <w14:ligatures w14:val="none"/>
+        </w:rPr>
+        <w:t>pwd</w:t>
+      </w:r>
+      <w:proofErr w:type="spellEnd"/>
+      <w:r>
+        <w:rPr>
+          <w:rFonts w:ascii="Menlo" w:eastAsia="Times New Roman" w:hAnsi="Menlo" w:cs="Menlo"/>
+          <w:color w:val="14181F"/>
+          <w:kern w:val="0"/>
+          <w:sz w:val="20"/>
+          <w:szCs w:val="20"/>
+          <w:bdr w:val="single" w:sz="2" w:space="0" w:color="1F1E1D" w:frame="1"/>
+          <w14:ligatures w14:val="none"/>
+        </w:rPr>
+        <w:t xml:space="preserve"> | sed 's|/|-|g')</w:t>
+      </w:r>
+    </w:p>
+    <w:p>
+      <w:pPr>
+        <w:pBdr>
+          <w:top w:val="single" w:sz="2" w:space="0" w:color="1F1E1D"/>
+          <w:left w:val="single" w:sz="2" w:space="0" w:color="1F1E1D"/>
+          <w:bottom w:val="single" w:sz="2" w:space="0" w:color="1F1E1D"/>
+          <w:right w:val="single" w:sz="2" w:space="0" w:color="1F1E1D"/>
+        </w:pBdr>
+        <w:tabs>
+          <w:tab w:val="left" w:pos="916"/>
+          <w:tab w:val="left" w:pos="1832"/>
+          <w:tab w:val="left" w:pos="2748"/>
+          <w:tab w:val="left" w:pos="3664"/>
+          <w:tab w:val="left" w:pos="4580"/>
+          <w:tab w:val="left" w:pos="5496"/>
+          <w:tab w:val="left" w:pos="6412"/>
+          <w:tab w:val="left" w:pos="7328"/>
+          <w:tab w:val="left" w:pos="8244"/>
+          <w:tab w:val="left" w:pos="9160"/>
+          <w:tab w:val="left" w:pos="10076"/>
+          <w:tab w:val="left" w:pos="10992"/>
+          <w:tab w:val="left" w:pos="11908"/>
+          <w:tab w:val="left" w:pos="12824"/>
+          <w:tab w:val="left" w:pos="13740"/>
+          <w:tab w:val="left" w:pos="14656"/>
+        </w:tabs>
+        <w:spacing w:after="0" w:line="240" w:lineRule="auto"/>
+        <w:rPr>
+          <w:rFonts w:ascii="Menlo" w:eastAsia="Times New Roman" w:hAnsi="Menlo" w:cs="Menlo"/>
+          <w:color w:val="14181F"/>
+          <w:kern w:val="0"/>
+          <w:sz w:val="20"/>
+          <w:szCs w:val="20"/>
+          <w:bdr w:val="single" w:sz="2" w:space="0" w:color="1F1E1D" w:frame="1"/>
+          <w14:ligatures w14:val="none"/>
+        </w:rPr>
+      </w:pPr>
+      <w:r>
+        <w:rPr>
+          <w:rFonts w:ascii="Menlo" w:eastAsia="Times New Roman" w:hAnsi="Menlo" w:cs="Menlo"/>
+          <w:color w:val="14181F"/>
+          <w:kern w:val="0"/>
+          <w:sz w:val="20"/>
+          <w:szCs w:val="20"/>
+          <w:bdr w:val="single" w:sz="2" w:space="0" w:color="1F1E1D" w:frame="1"/>
+          <w14:ligatures w14:val="none"/>
+        </w:rPr>
+        <w:t>RESPONSE=$(curl -s --max-time 310 -X POST http://localhost:3030/api/checkpoints \</w:t>
+      </w:r>
+    </w:p>
+    <w:p>
+      <w:pPr>
+        <w:pBdr>
+          <w:top w:val="single" w:sz="2" w:space="0" w:color="1F1E1D"/>
+          <w:left w:val="single" w:sz="2" w:space="0" w:color="1F1E1D"/>
+          <w:bottom w:val="single" w:sz="2" w:space="0" w:color="1F1E1D"/>
+          <w:right w:val="single" w:sz="2" w:space="0" w:color="1F1E1D"/>
+        </w:pBdr>
+        <w:tabs>
+          <w:tab w:val="left" w:pos="916"/>
+          <w:tab w:val="left" w:pos="1832"/>
+          <w:tab w:val="left" w:pos="2748"/>
+          <w:tab w:val="left" w:pos="3664"/>
+          <w:tab w:val="left" w:pos="4580"/>
+          <w:tab w:val="left" w:pos="5496"/>
+          <w:tab w:val="left" w:pos="6412"/>
+          <w:tab w:val="left" w:pos="7328"/>
+          <w:tab w:val="left" w:pos="8244"/>
+          <w:tab w:val="left" w:pos="9160"/>
+          <w:tab w:val="left" w:pos="10076"/>
+          <w:tab w:val="left" w:pos="10992"/>
+          <w:tab w:val="left" w:pos="11908"/>
+          <w:tab w:val="left" w:pos="12824"/>
+          <w:tab w:val="left" w:pos="13740"/>
+          <w:tab w:val="left" w:pos="14656"/>
+        </w:tabs>
+        <w:spacing w:after="0" w:line="240" w:lineRule="auto"/>
+        <w:rPr>
+          <w:rFonts w:ascii="Menlo" w:eastAsia="Times New Roman" w:hAnsi="Menlo" w:cs="Menlo"/>
+          <w:color w:val="14181F"/>
+          <w:kern w:val="0"/>
+          <w:sz w:val="20"/>
+          <w:szCs w:val="20"/>
+          <w:bdr w:val="single" w:sz="2" w:space="0" w:color="1F1E1D" w:frame="1"/>
+          <w14:ligatures w14:val="none"/>
+        </w:rPr>
+      </w:pPr>
+      <w:r>
+        <w:rPr>
+          <w:rFonts w:ascii="Menlo" w:eastAsia="Times New Roman" w:hAnsi="Menlo" w:cs="Menlo"/>
+          <w:color w:val="14181F"/>
+          <w:kern w:val="0"/>
+          <w:sz w:val="20"/>
+          <w:szCs w:val="20"/>
+          <w:bdr w:val="single" w:sz="2" w:space="0" w:color="1F1E1D" w:frame="1"/>
+          <w14:ligatures w14:val="none"/>
+        </w:rPr>
+        <w:t xml:space="preserve">  -H "Content-Type: application/</w:t>
+      </w:r>
+      <w:proofErr w:type="spellStart"/>
+      <w:r>
+        <w:rPr>
+          <w:rFonts w:ascii="Menlo" w:eastAsia="Times New Roman" w:hAnsi="Menlo" w:cs="Menlo"/>
+          <w:color w:val="14181F"/>
+          <w:kern w:val="0"/>
+          <w:sz w:val="20"/>
+          <w:szCs w:val="20"/>
+          <w:bdr w:val="single" w:sz="2" w:space="0" w:color="1F1E1D" w:frame="1"/>
+          <w14:ligatures w14:val="none"/>
+        </w:rPr>
+        <w:t>json</w:t>
+      </w:r>
+      <w:proofErr w:type="spellEnd"/>
+      <w:r>
+        <w:rPr>
+          <w:rFonts w:ascii="Menlo" w:eastAsia="Times New Roman" w:hAnsi="Menlo" w:cs="Menlo"/>
+          <w:color w:val="14181F"/>
+          <w:kern w:val="0"/>
+          <w:sz w:val="20"/>
+          <w:szCs w:val="20"/>
+          <w:bdr w:val="single" w:sz="2" w:space="0" w:color="1F1E1D" w:frame="1"/>
+          <w14:ligatures w14:val="none"/>
+        </w:rPr>
+        <w:t>" \</w:t>
+      </w:r>
+    </w:p>
+    <w:p>
+      <w:pPr>
+        <w:pBdr>
+          <w:top w:val="single" w:sz="2" w:space="0" w:color="1F1E1D"/>
+          <w:left w:val="single" w:sz="2" w:space="0" w:color="1F1E1D"/>
+          <w:bottom w:val="single" w:sz="2" w:space="0" w:color="1F1E1D"/>
+          <w:right w:val="single" w:sz="2" w:space="0" w:color="1F1E1D"/>
+        </w:pBdr>
+        <w:tabs>
+          <w:tab w:val="left" w:pos="916"/>
+          <w:tab w:val="left" w:pos="1832"/>
+          <w:tab w:val="left" w:pos="2748"/>
+          <w:tab w:val="left" w:pos="3664"/>
+          <w:tab w:val="left" w:pos="4580"/>
+          <w:tab w:val="left" w:pos="5496"/>
+          <w:tab w:val="left" w:pos="6412"/>
+          <w:tab w:val="left" w:pos="7328"/>
+          <w:tab w:val="left" w:pos="8244"/>
+          <w:tab w:val="left" w:pos="9160"/>
+          <w:tab w:val="left" w:pos="10076"/>
+          <w:tab w:val="left" w:pos="10992"/>
+          <w:tab w:val="left" w:pos="11908"/>
+          <w:tab w:val="left" w:pos="12824"/>
+          <w:tab w:val="left" w:pos="13740"/>
+          <w:tab w:val="left" w:pos="14656"/>
+        </w:tabs>
+        <w:spacing w:after="0" w:line="240" w:lineRule="auto"/>
+        <w:rPr>
+          <w:rFonts w:ascii="Menlo" w:eastAsia="Times New Roman" w:hAnsi="Menlo" w:cs="Menlo"/>
+          <w:color w:val="14181F"/>
+          <w:kern w:val="0"/>
+          <w:sz w:val="20"/>
+          <w:szCs w:val="20"/>
+          <w:bdr w:val="single" w:sz="2" w:space="0" w:color="1F1E1D" w:frame="1"/>
+          <w14:ligatures w14:val="none"/>
+        </w:rPr>
+      </w:pPr>
+      <w:r>
+        <w:rPr>
+          <w:rFonts w:ascii="Menlo" w:eastAsia="Times New Roman" w:hAnsi="Menlo" w:cs="Menlo"/>
+          <w:color w:val="14181F"/>
+          <w:kern w:val="0"/>
+          <w:sz w:val="20"/>
+          <w:szCs w:val="20"/>
+          <w:bdr w:val="single" w:sz="2" w:space="0" w:color="1F1E1D" w:frame="1"/>
+          <w14:ligatures w14:val="none"/>
+        </w:rPr>
+        <w:t xml:space="preserve">  -d @- &lt;&lt; 'JSONEOF'</w:t>
+      </w:r>
+    </w:p>
+    <w:p>
+      <w:pPr>
+        <w:pBdr>
+          <w:top w:val="single" w:sz="2" w:space="0" w:color="1F1E1D"/>
+          <w:left w:val="single" w:sz="2" w:space="0" w:color="1F1E1D"/>
+          <w:bottom w:val="single" w:sz="2" w:space="0" w:color="1F1E1D"/>
+          <w:right w:val="single" w:sz="2" w:space="0" w:color="1F1E1D"/>
+        </w:pBdr>
+        <w:tabs>
+          <w:tab w:val="left" w:pos="916"/>
+          <w:tab w:val="left" w:pos="1832"/>
+          <w:tab w:val="left" w:pos="2748"/>
+          <w:tab w:val="left" w:pos="3664"/>
+          <w:tab w:val="left" w:pos="4580"/>
+          <w:tab w:val="left" w:pos="5496"/>
+          <w:tab w:val="left" w:pos="6412"/>
+          <w:tab w:val="left" w:pos="7328"/>
+          <w:tab w:val="left" w:pos="8244"/>
+          <w:tab w:val="left" w:pos="9160"/>
+          <w:tab w:val="left" w:pos="10076"/>
+          <w:tab w:val="left" w:pos="10992"/>
+          <w:tab w:val="left" w:pos="11908"/>
+          <w:tab w:val="left" w:pos="12824"/>
+          <w:tab w:val="left" w:pos="13740"/>
+          <w:tab w:val="left" w:pos="14656"/>
+        </w:tabs>
+        <w:spacing w:after="0" w:line="240" w:lineRule="auto"/>
+        <w:rPr>
+          <w:rFonts w:ascii="Menlo" w:eastAsia="Times New Roman" w:hAnsi="Menlo" w:cs="Menlo"/>
+          <w:color w:val="14181F"/>
+          <w:kern w:val="0"/>
+          <w:sz w:val="20"/>
+          <w:szCs w:val="20"/>
+          <w:bdr w:val="single" w:sz="2" w:space="0" w:color="1F1E1D" w:frame="1"/>
+          <w14:ligatures w14:val="none"/>
+        </w:rPr>
+      </w:pPr>
+      <w:r>
+        <w:rPr>
+          <w:rFonts w:ascii="Menlo" w:eastAsia="Times New Roman" w:hAnsi="Menlo" w:cs="Menlo"/>
+          <w:color w:val="14181F"/>
+          <w:kern w:val="0"/>
+          <w:sz w:val="20"/>
+          <w:szCs w:val="20"/>
+          <w:bdr w:val="single" w:sz="2" w:space="0" w:color="1F1E1D" w:frame="1"/>
+          <w14:ligatures w14:val="none"/>
+        </w:rPr>
+        <w:t>{"</w:t>
+      </w:r>
+      <w:proofErr w:type="spellStart"/>
+      <w:r>
+        <w:rPr>
+          <w:rFonts w:ascii="Menlo" w:eastAsia="Times New Roman" w:hAnsi="Menlo" w:cs="Menlo"/>
+          <w:color w:val="14181F"/>
+          <w:kern w:val="0"/>
+          <w:sz w:val="20"/>
+          <w:szCs w:val="20"/>
+          <w:bdr w:val="single" w:sz="2" w:space="0" w:color="1F1E1D" w:frame="1"/>
+          <w14:ligatures w14:val="none"/>
+        </w:rPr>
+        <w:t>project_dir</w:t>
+      </w:r>
+      <w:proofErr w:type="spellEnd"/>
+      <w:r>
+        <w:rPr>
+          <w:rFonts w:ascii="Menlo" w:eastAsia="Times New Roman" w:hAnsi="Menlo" w:cs="Menlo"/>
+          <w:color w:val="14181F"/>
+          <w:kern w:val="0"/>
+          <w:sz w:val="20"/>
+          <w:szCs w:val="20"/>
+          <w:bdr w:val="single" w:sz="2" w:space="0" w:color="1F1E1D" w:frame="1"/>
+          <w14:ligatures w14:val="none"/>
+        </w:rPr>
+        <w:t>": "PUT_YOUR_PROJECT_KEY_HERE", "question": "YOUR QUESTION OR PLAN SUMMARY", "options": ["Yes, proceed", "Modify approach", "Cancel"]}</w:t>
+      </w:r>
+    </w:p>
+    <w:p>
+      <w:pPr>
+        <w:pBdr>
+          <w:top w:val="single" w:sz="2" w:space="0" w:color="1F1E1D"/>
+          <w:left w:val="single" w:sz="2" w:space="0" w:color="1F1E1D"/>
+          <w:bottom w:val="single" w:sz="2" w:space="0" w:color="1F1E1D"/>
+          <w:right w:val="single" w:sz="2" w:space="0" w:color="1F1E1D"/>
+        </w:pBdr>
+        <w:tabs>
+          <w:tab w:val="left" w:pos="916"/>
+          <w:tab w:val="left" w:pos="1832"/>
+          <w:tab w:val="left" w:pos="2748"/>
+          <w:tab w:val="left" w:pos="3664"/>
+          <w:tab w:val="left" w:pos="4580"/>
+          <w:tab w:val="left" w:pos="5496"/>
+          <w:tab w:val="left" w:pos="6412"/>
+          <w:tab w:val="left" w:pos="7328"/>
+          <w:tab w:val="left" w:pos="8244"/>
+          <w:tab w:val="left" w:pos="9160"/>
+          <w:tab w:val="left" w:pos="10076"/>
+          <w:tab w:val="left" w:pos="10992"/>
+          <w:tab w:val="left" w:pos="11908"/>
+          <w:tab w:val="left" w:pos="12824"/>
+          <w:tab w:val="left" w:pos="13740"/>
+          <w:tab w:val="left" w:pos="14656"/>
+        </w:tabs>
+        <w:spacing w:after="0" w:line="240" w:lineRule="auto"/>
+        <w:rPr>
+          <w:rFonts w:ascii="Menlo" w:eastAsia="Times New Roman" w:hAnsi="Menlo" w:cs="Menlo"/>
+          <w:color w:val="14181F"/>
+          <w:kern w:val="0"/>
+          <w:sz w:val="20"/>
+          <w:szCs w:val="20"/>
+          <w:bdr w:val="single" w:sz="2" w:space="0" w:color="1F1E1D" w:frame="1"/>
+          <w14:ligatures w14:val="none"/>
+        </w:rPr>
+      </w:pPr>
+      <w:r>
+        <w:rPr>
+          <w:rFonts w:ascii="Menlo" w:eastAsia="Times New Roman" w:hAnsi="Menlo" w:cs="Menlo"/>
+          <w:color w:val="14181F"/>
+          <w:kern w:val="0"/>
+          <w:sz w:val="20"/>
+          <w:szCs w:val="20"/>
+          <w:bdr w:val="single" w:sz="2" w:space="0" w:color="1F1E1D" w:frame="1"/>
+          <w14:ligatures w14:val="none"/>
+        </w:rPr>
+        <w:t>JSONEOF</w:t>
+      </w:r>
+    </w:p>
+    <w:p>
+      <w:pPr>
+        <w:pBdr>
+          <w:top w:val="single" w:sz="2" w:space="0" w:color="1F1E1D"/>
+          <w:left w:val="single" w:sz="2" w:space="0" w:color="1F1E1D"/>
+          <w:bottom w:val="single" w:sz="2" w:space="0" w:color="1F1E1D"/>
+          <w:right w:val="single" w:sz="2" w:space="0" w:color="1F1E1D"/>
+        </w:pBdr>
+        <w:tabs>
+          <w:tab w:val="left" w:pos="916"/>
+          <w:tab w:val="left" w:pos="1832"/>
+          <w:tab w:val="left" w:pos="2748"/>
+          <w:tab w:val="left" w:pos="3664"/>
+          <w:tab w:val="left" w:pos="4580"/>
+          <w:tab w:val="left" w:pos="5496"/>
+          <w:tab w:val="left" w:pos="6412"/>
+          <w:tab w:val="left" w:pos="7328"/>
+          <w:tab w:val="left" w:pos="8244"/>
+          <w:tab w:val="left" w:pos="9160"/>
+          <w:tab w:val="left" w:pos="10076"/>
+          <w:tab w:val="left" w:pos="10992"/>
+          <w:tab w:val="left" w:pos="11908"/>
+          <w:tab w:val="left" w:pos="12824"/>
+          <w:tab w:val="left" w:pos="13740"/>
+          <w:tab w:val="left" w:pos="14656"/>
+        </w:tabs>
+        <w:spacing w:after="0" w:line="240" w:lineRule="auto"/>
+        <w:rPr>
+          <w:rFonts w:ascii="Menlo" w:eastAsia="Times New Roman" w:hAnsi="Menlo" w:cs="Menlo"/>
+          <w:color w:val="14181F"/>
+          <w:kern w:val="0"/>
+          <w:sz w:val="20"/>
+          <w:szCs w:val="20"/>
+          <w:bdr w:val="single" w:sz="2" w:space="0" w:color="1F1E1D" w:frame="1"/>
+          <w14:ligatures w14:val="none"/>
+        </w:rPr>
+      </w:pPr>
+      <w:r>
+        <w:rPr>
+          <w:rFonts w:ascii="Menlo" w:eastAsia="Times New Roman" w:hAnsi="Menlo" w:cs="Menlo"/>
+          <w:color w:val="14181F"/>
+          <w:kern w:val="0"/>
+          <w:sz w:val="20"/>
+          <w:szCs w:val="20"/>
+          <w:bdr w:val="single" w:sz="2" w:space="0" w:color="1F1E1D" w:frame="1"/>
+          <w14:ligatures w14:val="none"/>
+        </w:rPr>
+        <w:t>)</w:t>
+      </w:r>
+    </w:p>
+    <w:p>
+      <w:pPr>
+        <w:pBdr>
+          <w:top w:val="single" w:sz="2" w:space="0" w:color="1F1E1D"/>
+          <w:left w:val="single" w:sz="2" w:space="0" w:color="1F1E1D"/>
+          <w:bottom w:val="single" w:sz="2" w:space="0" w:color="1F1E1D"/>
+          <w:right w:val="single" w:sz="2" w:space="0" w:color="1F1E1D"/>
+        </w:pBdr>
+        <w:tabs>
+          <w:tab w:val="left" w:pos="916"/>
+          <w:tab w:val="left" w:pos="1832"/>
+          <w:tab w:val="left" w:pos="2748"/>
+          <w:tab w:val="left" w:pos="3664"/>
+          <w:tab w:val="left" w:pos="4580"/>
+          <w:tab w:val="left" w:pos="5496"/>
+          <w:tab w:val="left" w:pos="6412"/>
+          <w:tab w:val="left" w:pos="7328"/>
+          <w:tab w:val="left" w:pos="8244"/>
+          <w:tab w:val="left" w:pos="9160"/>
+          <w:tab w:val="left" w:pos="10076"/>
+          <w:tab w:val="left" w:pos="10992"/>
+          <w:tab w:val="left" w:pos="11908"/>
+          <w:tab w:val="left" w:pos="12824"/>
+          <w:tab w:val="left" w:pos="13740"/>
+          <w:tab w:val="left" w:pos="14656"/>
+        </w:tabs>
+        <w:spacing w:after="0" w:line="240" w:lineRule="auto"/>
+        <w:rPr>
+          <w:rFonts w:ascii="Menlo" w:eastAsia="Times New Roman" w:hAnsi="Menlo" w:cs="Menlo"/>
+          <w:color w:val="14181F"/>
+          <w:kern w:val="0"/>
+          <w:sz w:val="20"/>
+          <w:szCs w:val="20"/>
+          <w:bdr w:val="single" w:sz="2" w:space="0" w:color="1F1E1D" w:frame="1"/>
+          <w14:ligatures w14:val="none"/>
+        </w:rPr>
+      </w:pPr>
+      <w:r>
+        <w:rPr>
+          <w:rFonts w:ascii="Menlo" w:eastAsia="Times New Roman" w:hAnsi="Menlo" w:cs="Menlo"/>
+          <w:color w:val="14181F"/>
+          <w:kern w:val="0"/>
+          <w:sz w:val="20"/>
+          <w:szCs w:val="20"/>
+          <w:bdr w:val="single" w:sz="2" w:space="0" w:color="1F1E1D" w:frame="1"/>
+          <w14:ligatures w14:val="none"/>
+        </w:rPr>
+        <w:t>echo "$RESPONSE"</w:t>
+      </w:r>
+    </w:p>
+    <w:p>
+      <w:pPr>
+        <w:pBdr>
+          <w:top w:val="single" w:sz="2" w:space="0" w:color="1F1E1D"/>
+          <w:left w:val="single" w:sz="2" w:space="0" w:color="1F1E1D"/>
+          <w:bottom w:val="single" w:sz="2" w:space="0" w:color="1F1E1D"/>
+          <w:right w:val="single" w:sz="2" w:space="0" w:color="1F1E1D"/>
+        </w:pBdr>
+        <w:shd w:val="clear" w:color="auto" w:fill="FFFFFF"/>
+        <w:spacing w:before="120" w:after="0" w:line="240" w:lineRule="auto"/>
+        <w:rPr>
+          <w:rFonts w:ascii="Segoe UI" w:eastAsia="Times New Roman" w:hAnsi="Segoe UI" w:cs="Segoe UI"/>
+          <w:color w:val="141413"/>
+          <w:kern w:val="0"/>
+          <w:sz w:val="21"/>
+          <w:szCs w:val="21"/>
+          <w14:ligatures w14:val="none"/>
+        </w:rPr>
+      </w:pPr>
+      <w:r>
+        <w:rPr>
+          <w:rFonts w:ascii="Segoe UI" w:eastAsia="Times New Roman" w:hAnsi="Segoe UI" w:cs="Segoe UI"/>
+          <w:color w:val="141413"/>
+          <w:kern w:val="0"/>
+          <w:sz w:val="21"/>
+          <w:szCs w:val="21"/>
+          <w14:ligatures w14:val="none"/>
+        </w:rPr>
+        <w:t xml:space="preserve">Replace the </w:t>
+      </w:r>
+      <w:proofErr w:type="spellStart"/>
+      <w:r>
+        <w:rPr>
+          <w:rFonts w:ascii="Segoe UI" w:eastAsia="Times New Roman" w:hAnsi="Segoe UI" w:cs="Segoe UI"/>
+          <w:color w:val="141413"/>
+          <w:kern w:val="0"/>
+          <w:sz w:val="21"/>
+          <w:szCs w:val="21"/>
+          <w14:ligatures w14:val="none"/>
+        </w:rPr>
+        <w:t>project_dir</w:t>
+      </w:r>
+      <w:proofErr w:type="spellEnd"/>
+      <w:r>
+        <w:rPr>
+          <w:rFonts w:ascii="Segoe UI" w:eastAsia="Times New Roman" w:hAnsi="Segoe UI" w:cs="Segoe UI"/>
+          <w:color w:val="141413"/>
+          <w:kern w:val="0"/>
+          <w:sz w:val="21"/>
+          <w:szCs w:val="21"/>
+          <w14:ligatures w14:val="none"/>
+        </w:rPr>
+        <w:t xml:space="preserve"> with your actual PROJECT_KEY and the question with what you're asking. The curl will BLOCK until I respond from my phone (up to 5 min). The response JSON has </w:t>
+      </w:r>
+      <w:r>
+        <w:rPr>
+          <w:rFonts w:ascii="Menlo" w:eastAsia="Times New Roman" w:hAnsi="Menlo" w:cs="Menlo"/>
+          <w:color w:val="8A2424"/>
+          <w:kern w:val="0"/>
+          <w:sz w:val="20"/>
+          <w:szCs w:val="20"/>
+          <w14:ligatures w14:val="none"/>
+        </w:rPr>
+        <w:t>"status"</w:t>
+      </w:r>
+      <w:r>
+        <w:rPr>
+          <w:rFonts w:ascii="Segoe UI" w:eastAsia="Times New Roman" w:hAnsi="Segoe UI" w:cs="Segoe UI"/>
+          <w:color w:val="141413"/>
+          <w:kern w:val="0"/>
+          <w:sz w:val="21"/>
+          <w:szCs w:val="21"/>
+          <w14:ligatures w14:val="none"/>
+        </w:rPr>
+        <w:t> ("responded" or "timeout") and </w:t>
+      </w:r>
+      <w:r>
+        <w:rPr>
+          <w:rFonts w:ascii="Menlo" w:eastAsia="Times New Roman" w:hAnsi="Menlo" w:cs="Menlo"/>
+          <w:color w:val="8A2424"/>
+          <w:kern w:val="0"/>
+          <w:sz w:val="20"/>
+          <w:szCs w:val="20"/>
+          <w14:ligatures w14:val="none"/>
+        </w:rPr>
+        <w:t>"response"</w:t>
+      </w:r>
+      <w:r>
+        <w:rPr>
+          <w:rFonts w:ascii="Segoe UI" w:eastAsia="Times New Roman" w:hAnsi="Segoe UI" w:cs="Segoe UI"/>
+          <w:color w:val="141413"/>
+          <w:kern w:val="0"/>
+          <w:sz w:val="21"/>
+          <w:szCs w:val="21"/>
+          <w14:ligatures w14:val="none"/>
+        </w:rPr>
+        <w:t> (my text).</w:t>
+      </w:r>
+    </w:p>
+    <w:p>
+      <w:pPr>
+        <w:pBdr>
+          <w:top w:val="single" w:sz="2" w:space="0" w:color="1F1E1D"/>
+          <w:left w:val="single" w:sz="2" w:space="0" w:color="1F1E1D"/>
+          <w:bottom w:val="single" w:sz="2" w:space="0" w:color="1F1E1D"/>
+          <w:right w:val="single" w:sz="2" w:space="0" w:color="1F1E1D"/>
+        </w:pBdr>
+        <w:shd w:val="clear" w:color="auto" w:fill="FFFFFF"/>
+        <w:spacing w:before="120" w:after="0" w:line="240" w:lineRule="auto"/>
+        <w:rPr>
+          <w:rFonts w:ascii="Segoe UI" w:eastAsia="Times New Roman" w:hAnsi="Segoe UI" w:cs="Segoe UI"/>
+          <w:color w:val="141413"/>
+          <w:kern w:val="0"/>
+          <w:sz w:val="21"/>
+          <w:szCs w:val="21"/>
+          <w14:ligatures w14:val="none"/>
+        </w:rPr>
+      </w:pPr>
+      <w:r>
+        <w:rPr>
+          <w:rFonts w:ascii="Segoe UI" w:eastAsia="Times New Roman" w:hAnsi="Segoe UI" w:cs="Segoe UI"/>
+          <w:color w:val="141413"/>
+          <w:kern w:val="0"/>
+          <w:sz w:val="21"/>
+          <w:szCs w:val="21"/>
+          <w14:ligatures w14:val="none"/>
+        </w:rPr>
+        <w:t>Use this for plan approvals and major decisions. Don't use it for minor stuff you can decide yourself. If it times out, save your progress and note what you were waiting on.</w:t>
+      </w:r>
+    </w:p>
+    <w:p>
+      <w:pPr>
+        <w:pBdr>
+          <w:top w:val="single" w:sz="2" w:space="0" w:color="1F1E1D"/>
+          <w:left w:val="single" w:sz="2" w:space="0" w:color="1F1E1D"/>
+          <w:bottom w:val="single" w:sz="2" w:space="0" w:color="1F1E1D"/>
+          <w:right w:val="single" w:sz="2" w:space="0" w:color="1F1E1D"/>
+        </w:pBdr>
+        <w:shd w:val="clear" w:color="auto" w:fill="FFFFFF"/>
+        <w:spacing w:before="120" w:after="0" w:line="240" w:lineRule="auto"/>
+        <w:rPr>
+          <w:rFonts w:ascii="Segoe UI" w:eastAsia="Times New Roman" w:hAnsi="Segoe UI" w:cs="Segoe UI"/>
+          <w:color w:val="141413"/>
+          <w:kern w:val="0"/>
+          <w:sz w:val="21"/>
+          <w:szCs w:val="21"/>
+          <w14:ligatures w14:val="none"/>
+        </w:rPr>
+      </w:pPr>
+      <w:r>
+        <w:rPr>
+          <w:rFonts w:ascii="Segoe UI" w:eastAsia="Times New Roman" w:hAnsi="Segoe UI" w:cs="Segoe UI"/>
+          <w:color w:val="141413"/>
+          <w:kern w:val="0"/>
+          <w:sz w:val="21"/>
+          <w:szCs w:val="21"/>
+          <w14:ligatures w14:val="none"/>
+        </w:rPr>
+        <w:t>Also: I can now send you messages in real-time while you work — they arrive automatically between tool calls. Just acknowledge them when you see them.</w:t>
+      </w:r>
+    </w:p>
+    <w:p>
+      <w:pPr>
+        <w:pStyle w:val="NormalWeb"/>
       </w:pPr>
       <w:r>
         <w:br/>
       </w:r>
       <w:r>
+        <w:br/>
+      </w:r>
+      <w:r>
+        <w:t xml:space="preserve">Ok so </w:t>
+      </w:r>
+      <w:proofErr w:type="spellStart"/>
+      <w:r>
+        <w:t>ill</w:t>
+      </w:r>
+      <w:proofErr w:type="spellEnd"/>
+      <w:r>
+        <w:t xml:space="preserve"> give them that, but in the meantime </w:t>
+      </w:r>
+      <w:proofErr w:type="spellStart"/>
+      <w:r>
+        <w:t>im</w:t>
+      </w:r>
+      <w:proofErr w:type="spellEnd"/>
+      <w:r>
+        <w:t xml:space="preserve"> having a bug that is </w:t>
+      </w:r>
+      <w:r>
+        <w:t xml:space="preserve">persistently happening across my </w:t>
+      </w:r>
+      <w:proofErr w:type="spellStart"/>
+      <w:r>
+        <w:t>claude</w:t>
+      </w:r>
+      <w:proofErr w:type="spellEnd"/>
+      <w:r>
+        <w:t xml:space="preserve"> sessions, </w:t>
+      </w:r>
+      <w:proofErr w:type="spellStart"/>
+      <w:r>
+        <w:t>im</w:t>
+      </w:r>
+      <w:proofErr w:type="spellEnd"/>
+      <w:r>
+        <w:t xml:space="preserve"> not sure if it’s a </w:t>
+      </w:r>
+      <w:proofErr w:type="spellStart"/>
+      <w:r>
+        <w:t>claude</w:t>
+      </w:r>
+      <w:proofErr w:type="spellEnd"/>
+      <w:r>
+        <w:t xml:space="preserve"> thing right now, or if </w:t>
+      </w:r>
+      <w:proofErr w:type="spellStart"/>
+      <w:r>
+        <w:t>its</w:t>
+      </w:r>
+      <w:proofErr w:type="spellEnd"/>
+      <w:r>
+        <w:t xml:space="preserve"> from my system, but its manifesting in the following ways</w:t>
+      </w:r>
+      <w:r>
+        <w:br/>
+        <w:t>- I start tying into a chat, and mid typing, before I ever hit enter it just sends the message in the chat, it seems to have happened on messages a few times as well</w:t>
+      </w:r>
+    </w:p>
+    <w:p>
+      <w:pPr>
+        <w:pStyle w:val="NormalWeb"/>
+        <w:numPr>
+          <w:ilvl w:val="0"/>
+          <w:numId w:val="1"/>
+        </w:numPr>
+      </w:pPr>
+      <w:r>
+        <w:t xml:space="preserve">In another app like messages, while </w:t>
+      </w:r>
+      <w:proofErr w:type="spellStart"/>
+      <w:r>
+        <w:t>im</w:t>
+      </w:r>
+      <w:proofErr w:type="spellEnd"/>
+      <w:r>
+        <w:t xml:space="preserve"> doing stuff in it, </w:t>
+      </w:r>
+      <w:proofErr w:type="spellStart"/>
+      <w:r>
+        <w:t>cluade</w:t>
+      </w:r>
+      <w:proofErr w:type="spellEnd"/>
+      <w:r>
+        <w:t xml:space="preserve"> desktop will just randomly get surfaced, as if I clicked it. </w:t>
+      </w:r>
+    </w:p>
+    <w:p>
+      <w:pPr>
+        <w:pStyle w:val="NormalWeb"/>
+        <w:numPr>
+          <w:ilvl w:val="0"/>
+          <w:numId w:val="1"/>
+        </w:numPr>
+      </w:pPr>
+      <w:r>
+        <w:t xml:space="preserve">Try to figure out what’s going on here? </w:t>
+      </w:r>
+    </w:p>
+    <w:p>
+      <w:pPr>
+        <w:pStyle w:val="p1"/>
+      </w:pPr>
+      <w:r>
+        <w:br/>
+      </w:r>
+      <w:r>
+        <w:br/>
+      </w:r>
+      <w:r>
+        <w:br/>
+      </w:r>
+      <w:r>
+        <w:br/>
+      </w:r>
+      <w:r>
+        <w:br/>
+      </w:r>
+      <w:r>
+        <w:br/>
+      </w:r>
+      <w:r>
+        <w:br/>
+      </w:r>
+      <w:r>
+        <w:br/>
+      </w:r>
+      <w:r>
+        <w:br/>
+      </w:r>
+      <w:r>
+        <w:br/>
+      </w:r>
+      <w:r>
+        <w:lastRenderedPageBreak/>
         <w:br/>
       </w:r>
       <w:r>
@@ -320,15 +1322,15 @@
         <w:pStyle w:val="p1"/>
       </w:pPr>
       <w:r>
+        <w:t>No duplicates have been created since I removed it.</w:t>
+      </w:r>
+    </w:p>
+    <w:p>
+      <w:pPr>
+        <w:pStyle w:val="p1"/>
+      </w:pPr>
+      <w:r>
         <w:lastRenderedPageBreak/>
-        <w:t>No duplicates have been created since I removed it.</w:t>
-      </w:r>
-    </w:p>
-    <w:p>
-      <w:pPr>
-        <w:pStyle w:val="p1"/>
-      </w:pPr>
-      <w:r>
         <w:t>Strategic question: Agree with A. Deterministic via accessibility tree is the right call.</w:t>
       </w:r>
     </w:p>
@@ -758,7 +1760,6 @@
         <w:pStyle w:val="p1"/>
       </w:pPr>
       <w:r>
-        <w:lastRenderedPageBreak/>
         <w:t xml:space="preserve">agent-brain </w:t>
       </w:r>
       <w:r>
@@ -806,6 +1807,7 @@
         <w:pStyle w:val="p1"/>
       </w:pPr>
       <w:r>
+        <w:lastRenderedPageBreak/>
         <w:t>insiders-</w:t>
       </w:r>
       <w:proofErr w:type="spellStart"/>
@@ -1211,353 +2213,352 @@
         <w:pStyle w:val="p1"/>
       </w:pPr>
       <w:r>
+        <w:t xml:space="preserve">5.2 One-time $20 to start. When you're shipping regular updates, introduce $5/month or $30/year for new buyers. Grandfather the one-time purchasers. License key validated via </w:t>
+      </w:r>
+      <w:proofErr w:type="spellStart"/>
+      <w:r>
+        <w:t>Gumroad's</w:t>
+      </w:r>
+      <w:proofErr w:type="spellEnd"/>
+      <w:r>
+        <w:t xml:space="preserve"> API on startup. You'll know within 2 months which model fits.</w:t>
+      </w:r>
+    </w:p>
+    <w:p>
+      <w:pPr>
+        <w:pStyle w:val="p2"/>
+      </w:pPr>
+    </w:p>
+    <w:p>
+      <w:pPr>
+        <w:pStyle w:val="p1"/>
+      </w:pPr>
+      <w:r>
+        <w:t>5.3 Founders who code, and vibe coder power users is the right primary target. They're running Claude Code on real projects, but they're also in meetings, on their phone, walking around. They can't babysit a terminal. They'll pay $20 without blinking if it means their agent doesn't sit idle for 30 minutes waiting on a permission prompt.</w:t>
+      </w:r>
+    </w:p>
+    <w:p>
+      <w:pPr>
+        <w:pStyle w:val="p1"/>
+      </w:pPr>
+      <w:r>
+        <w:t xml:space="preserve">Secondary: solo </w:t>
+      </w:r>
+      <w:proofErr w:type="spellStart"/>
+      <w:r>
+        <w:t>devs</w:t>
+      </w:r>
+      <w:proofErr w:type="spellEnd"/>
+      <w:r>
+        <w:t xml:space="preserve"> and indie hackers with the same pattern — kick off a task, walk away, supervise from phone.</w:t>
+      </w:r>
+    </w:p>
+    <w:p>
+      <w:pPr>
+        <w:pStyle w:val="p1"/>
+      </w:pPr>
+      <w:r>
+        <w:t xml:space="preserve">Not enterprise developers (they're at desks with laptops open), </w:t>
+      </w:r>
+      <w:proofErr w:type="spellStart"/>
+      <w:r>
+        <w:t>mayb</w:t>
+      </w:r>
+      <w:proofErr w:type="spellEnd"/>
+      <w:r>
+        <w:t xml:space="preserve"> </w:t>
+      </w:r>
+      <w:proofErr w:type="spellStart"/>
+      <w:r>
+        <w:t>non technical</w:t>
+      </w:r>
+      <w:proofErr w:type="spellEnd"/>
+      <w:r>
+        <w:t xml:space="preserve"> operators, as more and more people are getting technical </w:t>
+      </w:r>
+      <w:proofErr w:type="spellStart"/>
+      <w:r>
+        <w:t>ish</w:t>
+      </w:r>
+      <w:proofErr w:type="spellEnd"/>
+      <w:r>
+        <w:t xml:space="preserve">, </w:t>
+      </w:r>
+      <w:proofErr w:type="spellStart"/>
+      <w:r>
+        <w:t>im</w:t>
+      </w:r>
+      <w:proofErr w:type="spellEnd"/>
+      <w:r>
+        <w:t xml:space="preserve"> not technical and </w:t>
+      </w:r>
+      <w:proofErr w:type="spellStart"/>
+      <w:r>
+        <w:t>i've</w:t>
+      </w:r>
+      <w:proofErr w:type="spellEnd"/>
+      <w:r>
+        <w:t xml:space="preserve"> figured this out.</w:t>
+      </w:r>
+    </w:p>
+    <w:p>
+      <w:pPr>
+        <w:pStyle w:val="p2"/>
+      </w:pPr>
+    </w:p>
+    <w:p>
+      <w:pPr>
+        <w:pStyle w:val="p1"/>
+      </w:pPr>
+      <w:r>
+        <w:t>5.4 Hybrid. Core open source on GitHub, paid for the polished mobile supervision layer.</w:t>
+      </w:r>
+    </w:p>
+    <w:p>
+      <w:pPr>
+        <w:pStyle w:val="p1"/>
+      </w:pPr>
+      <w:r>
+        <w:t>Open core gets you: GitHub stars, community trust, bug reports, HN visibility, people self-hosting for free and telling their friends. That's your marketing engine.</w:t>
+      </w:r>
+    </w:p>
+    <w:p>
+      <w:pPr>
+        <w:pStyle w:val="p1"/>
+      </w:pPr>
+      <w:r>
+        <w:t>The paid layer is the supervision dashboard, auto-approve settings, cross-session notifications, guided setup wizard — the UX that makes it effortless. The stuff a founder pays $20 to not build themselves.</w:t>
+      </w:r>
+    </w:p>
+    <w:p>
+      <w:pPr>
+        <w:pStyle w:val="p1"/>
+      </w:pPr>
+      <w:r>
+        <w:t>Framing: "The engine is free. The cockpit is paid."</w:t>
+      </w:r>
+    </w:p>
+    <w:p>
+      <w:pPr>
+        <w:pStyle w:val="p1"/>
+      </w:pPr>
+      <w:r>
+        <w:t>Take on your take: Exactly right. "Remote Claude" is a feature Anthropic ships in a Tuesday update and you're dead. "Mobile supervision for local AI agents" is a category. Claude is adapter #1, but the value proposition is the supervision pattern — stall detection, approval governance, attention routing, session aggregation.</w:t>
+      </w:r>
+    </w:p>
+    <w:p>
+      <w:pPr>
+        <w:pStyle w:val="p1"/>
+      </w:pPr>
+      <w:r>
+        <w:t>"Remote Claude" competes with Anthropic. "Mobile supervision" competes with nobody.</w:t>
+      </w:r>
+    </w:p>
+    <w:p>
+      <w:pPr>
+        <w:pStyle w:val="p2"/>
+      </w:pPr>
+    </w:p>
+    <w:p>
+      <w:pPr>
+        <w:pStyle w:val="p1"/>
+      </w:pPr>
+      <w:r>
+        <w:t>6.1 Yes, if we're the supervision layer. No, if we're just remote access.</w:t>
+      </w:r>
+    </w:p>
+    <w:p>
+      <w:pPr>
+        <w:pStyle w:val="p1"/>
+      </w:pPr>
+      <w:r>
+        <w:t>If Anthropic adds all three of those, they've solved "use Claude Code from your phone." But they haven't solved:</w:t>
+      </w:r>
+    </w:p>
+    <w:p>
+      <w:pPr>
+        <w:pStyle w:val="p1"/>
+      </w:pPr>
+      <w:r>
+        <w:t>Cross-session attention dashboard — "which of my 5 running agents needs me right now"</w:t>
+      </w:r>
+    </w:p>
+    <w:p>
+      <w:pPr>
+        <w:pStyle w:val="p1"/>
+      </w:pPr>
+      <w:r>
+        <w:t>Auto-approve policies — customizable governance rules per tool, per project</w:t>
+      </w:r>
+    </w:p>
+    <w:p>
+      <w:pPr>
+        <w:pStyle w:val="p1"/>
+      </w:pPr>
+      <w:r>
+        <w:t>Multi-runtime supervision — Claude is adapter #1, but Cursor/Windsurf/terminal jobs are next</w:t>
+      </w:r>
+    </w:p>
+    <w:p>
+      <w:pPr>
+        <w:pStyle w:val="p1"/>
+      </w:pPr>
+      <w:r>
+        <w:t>Aggregated notification view across sessions and runtimes</w:t>
+      </w:r>
+    </w:p>
+    <w:p>
+      <w:pPr>
+        <w:pStyle w:val="p1"/>
+      </w:pPr>
+      <w:r>
+        <w:t>Anthropic will always optimize for one-session-at-a-time UX. They're not building a control tower for people running multiple agents across multiple tools.</w:t>
+      </w:r>
+    </w:p>
+    <w:p>
+      <w:pPr>
+        <w:pStyle w:val="p2"/>
+      </w:pPr>
+    </w:p>
+    <w:p>
+      <w:pPr>
+        <w:pStyle w:val="p1"/>
+      </w:pPr>
+      <w:r>
+        <w:t>Answer to 6.2 and 6.3: What Anthropic Shipped (Feb 24-25, 2026)</w:t>
+      </w:r>
+    </w:p>
+    <w:p>
+      <w:pPr>
+        <w:pStyle w:val="p1"/>
+      </w:pPr>
+      <w:r>
+        <w:t>Claude Code Remote Control — almost exactly what Agent Brain does:</w:t>
+      </w:r>
+    </w:p>
+    <w:p>
+      <w:pPr>
+        <w:pStyle w:val="p1"/>
+      </w:pPr>
+      <w:r>
+        <w:t>See sessions from phone in real-time</w:t>
+      </w:r>
+    </w:p>
+    <w:p>
+      <w:pPr>
+        <w:pStyle w:val="p1"/>
+      </w:pPr>
+      <w:r>
+        <w:t>Send messages from mobile</w:t>
+      </w:r>
+    </w:p>
+    <w:p>
+      <w:pPr>
+        <w:pStyle w:val="p1"/>
+      </w:pPr>
+      <w:r>
+        <w:t>Approve/reject tool calls from mobile</w:t>
+      </w:r>
+    </w:p>
+    <w:p>
+      <w:pPr>
+        <w:pStyle w:val="p1"/>
+      </w:pPr>
+      <w:r>
+        <w:t>Multiple sessions visible in session list</w:t>
+      </w:r>
+    </w:p>
+    <w:p>
+      <w:pPr>
+        <w:pStyle w:val="p1"/>
+      </w:pPr>
+      <w:r>
+        <w:t xml:space="preserve">Requires local terminal running </w:t>
+      </w:r>
+      <w:proofErr w:type="spellStart"/>
+      <w:r>
+        <w:t>claude</w:t>
+      </w:r>
+      <w:proofErr w:type="spellEnd"/>
+      <w:r>
+        <w:t xml:space="preserve"> remote-control or /</w:t>
+      </w:r>
+      <w:proofErr w:type="spellStart"/>
+      <w:r>
+        <w:t>rc</w:t>
+      </w:r>
+      <w:proofErr w:type="spellEnd"/>
+    </w:p>
+    <w:p>
+      <w:pPr>
+        <w:pStyle w:val="p1"/>
+      </w:pPr>
+      <w:r>
+        <w:t>What Agent Brain Does That Remote Control Doesn't</w:t>
+      </w:r>
+    </w:p>
+    <w:p>
+      <w:pPr>
+        <w:pStyle w:val="p1"/>
+      </w:pPr>
+      <w:r>
+        <w:t>Today, honestly? The gap is small:</w:t>
+      </w:r>
+    </w:p>
+    <w:p>
+      <w:pPr>
+        <w:pStyle w:val="p1"/>
+      </w:pPr>
+      <w:r>
+        <w:t xml:space="preserve">No terminal required — Remote Control needs you to run </w:t>
+      </w:r>
+      <w:proofErr w:type="spellStart"/>
+      <w:r>
+        <w:t>claude</w:t>
+      </w:r>
+      <w:proofErr w:type="spellEnd"/>
+      <w:r>
+        <w:t xml:space="preserve"> remote-control in a terminal first. Agent Brain works with Claude Desktop's Code mode directly, no CLI</w:t>
+      </w:r>
+    </w:p>
+    <w:p>
+      <w:pPr>
+        <w:pStyle w:val="p1"/>
+      </w:pPr>
+      <w:r>
+        <w:t>Session adoption — we wrap existing sessions without them needing to be started in a special mode</w:t>
+      </w:r>
+    </w:p>
+    <w:p>
+      <w:pPr>
+        <w:pStyle w:val="p1"/>
+      </w:pPr>
+      <w:r>
+        <w:t>Works with Desktop app — Remote Control is CLI-only. Claude Desktop Code sessions aren't supported</w:t>
+      </w:r>
+    </w:p>
+    <w:p>
+      <w:pPr>
+        <w:pStyle w:val="p1"/>
+      </w:pPr>
+      <w:r>
+        <w:t>Where there's real daylight:</w:t>
+      </w:r>
+    </w:p>
+    <w:p>
+      <w:pPr>
+        <w:pStyle w:val="p1"/>
+      </w:pPr>
+      <w:r>
+        <w:t>Cross-session attention dashboard — "what needs me right now" across all sessions. Remote Control shows a session list but no aggregated supervision view</w:t>
+      </w:r>
+    </w:p>
+    <w:p>
+      <w:pPr>
+        <w:pStyle w:val="p1"/>
+      </w:pPr>
+      <w:r>
         <w:lastRenderedPageBreak/>
-        <w:t xml:space="preserve">5.2 One-time $20 to start. When you're shipping regular updates, introduce $5/month or $30/year for new buyers. Grandfather the one-time purchasers. License key validated via </w:t>
-      </w:r>
-      <w:proofErr w:type="spellStart"/>
-      <w:r>
-        <w:t>Gumroad's</w:t>
-      </w:r>
-      <w:proofErr w:type="spellEnd"/>
-      <w:r>
-        <w:t xml:space="preserve"> API on startup. You'll know within 2 months which model fits.</w:t>
-      </w:r>
-    </w:p>
-    <w:p>
-      <w:pPr>
-        <w:pStyle w:val="p2"/>
-      </w:pPr>
-    </w:p>
-    <w:p>
-      <w:pPr>
-        <w:pStyle w:val="p1"/>
-      </w:pPr>
-      <w:r>
-        <w:t>5.3 Founders who code, and vibe coder power users is the right primary target. They're running Claude Code on real projects, but they're also in meetings, on their phone, walking around. They can't babysit a terminal. They'll pay $20 without blinking if it means their agent doesn't sit idle for 30 minutes waiting on a permission prompt.</w:t>
-      </w:r>
-    </w:p>
-    <w:p>
-      <w:pPr>
-        <w:pStyle w:val="p1"/>
-      </w:pPr>
-      <w:r>
-        <w:t xml:space="preserve">Secondary: solo </w:t>
-      </w:r>
-      <w:proofErr w:type="spellStart"/>
-      <w:r>
-        <w:t>devs</w:t>
-      </w:r>
-      <w:proofErr w:type="spellEnd"/>
-      <w:r>
-        <w:t xml:space="preserve"> and indie hackers with the same pattern — kick off a task, walk away, supervise from phone.</w:t>
-      </w:r>
-    </w:p>
-    <w:p>
-      <w:pPr>
-        <w:pStyle w:val="p1"/>
-      </w:pPr>
-      <w:r>
-        <w:t xml:space="preserve">Not enterprise developers (they're at desks with laptops open), </w:t>
-      </w:r>
-      <w:proofErr w:type="spellStart"/>
-      <w:r>
-        <w:t>mayb</w:t>
-      </w:r>
-      <w:proofErr w:type="spellEnd"/>
-      <w:r>
-        <w:t xml:space="preserve"> </w:t>
-      </w:r>
-      <w:proofErr w:type="spellStart"/>
-      <w:r>
-        <w:t>non technical</w:t>
-      </w:r>
-      <w:proofErr w:type="spellEnd"/>
-      <w:r>
-        <w:t xml:space="preserve"> operators, as more and more people are getting technical </w:t>
-      </w:r>
-      <w:proofErr w:type="spellStart"/>
-      <w:r>
-        <w:t>ish</w:t>
-      </w:r>
-      <w:proofErr w:type="spellEnd"/>
-      <w:r>
-        <w:t xml:space="preserve">, </w:t>
-      </w:r>
-      <w:proofErr w:type="spellStart"/>
-      <w:r>
-        <w:t>im</w:t>
-      </w:r>
-      <w:proofErr w:type="spellEnd"/>
-      <w:r>
-        <w:t xml:space="preserve"> not technical and </w:t>
-      </w:r>
-      <w:proofErr w:type="spellStart"/>
-      <w:r>
-        <w:t>i've</w:t>
-      </w:r>
-      <w:proofErr w:type="spellEnd"/>
-      <w:r>
-        <w:t xml:space="preserve"> figured this out.</w:t>
-      </w:r>
-    </w:p>
-    <w:p>
-      <w:pPr>
-        <w:pStyle w:val="p2"/>
-      </w:pPr>
-    </w:p>
-    <w:p>
-      <w:pPr>
-        <w:pStyle w:val="p1"/>
-      </w:pPr>
-      <w:r>
-        <w:t>5.4 Hybrid. Core open source on GitHub, paid for the polished mobile supervision layer.</w:t>
-      </w:r>
-    </w:p>
-    <w:p>
-      <w:pPr>
-        <w:pStyle w:val="p1"/>
-      </w:pPr>
-      <w:r>
-        <w:t>Open core gets you: GitHub stars, community trust, bug reports, HN visibility, people self-hosting for free and telling their friends. That's your marketing engine.</w:t>
-      </w:r>
-    </w:p>
-    <w:p>
-      <w:pPr>
-        <w:pStyle w:val="p1"/>
-      </w:pPr>
-      <w:r>
-        <w:t>The paid layer is the supervision dashboard, auto-approve settings, cross-session notifications, guided setup wizard — the UX that makes it effortless. The stuff a founder pays $20 to not build themselves.</w:t>
-      </w:r>
-    </w:p>
-    <w:p>
-      <w:pPr>
-        <w:pStyle w:val="p1"/>
-      </w:pPr>
-      <w:r>
-        <w:t>Framing: "The engine is free. The cockpit is paid."</w:t>
-      </w:r>
-    </w:p>
-    <w:p>
-      <w:pPr>
-        <w:pStyle w:val="p1"/>
-      </w:pPr>
-      <w:r>
-        <w:t>Take on your take: Exactly right. "Remote Claude" is a feature Anthropic ships in a Tuesday update and you're dead. "Mobile supervision for local AI agents" is a category. Claude is adapter #1, but the value proposition is the supervision pattern — stall detection, approval governance, attention routing, session aggregation.</w:t>
-      </w:r>
-    </w:p>
-    <w:p>
-      <w:pPr>
-        <w:pStyle w:val="p1"/>
-      </w:pPr>
-      <w:r>
-        <w:t>"Remote Claude" competes with Anthropic. "Mobile supervision" competes with nobody.</w:t>
-      </w:r>
-    </w:p>
-    <w:p>
-      <w:pPr>
-        <w:pStyle w:val="p2"/>
-      </w:pPr>
-    </w:p>
-    <w:p>
-      <w:pPr>
-        <w:pStyle w:val="p1"/>
-      </w:pPr>
-      <w:r>
-        <w:t>6.1 Yes, if we're the supervision layer. No, if we're just remote access.</w:t>
-      </w:r>
-    </w:p>
-    <w:p>
-      <w:pPr>
-        <w:pStyle w:val="p1"/>
-      </w:pPr>
-      <w:r>
-        <w:t>If Anthropic adds all three of those, they've solved "use Claude Code from your phone." But they haven't solved:</w:t>
-      </w:r>
-    </w:p>
-    <w:p>
-      <w:pPr>
-        <w:pStyle w:val="p1"/>
-      </w:pPr>
-      <w:r>
-        <w:t>Cross-session attention dashboard — "which of my 5 running agents needs me right now"</w:t>
-      </w:r>
-    </w:p>
-    <w:p>
-      <w:pPr>
-        <w:pStyle w:val="p1"/>
-      </w:pPr>
-      <w:r>
-        <w:t>Auto-approve policies — customizable governance rules per tool, per project</w:t>
-      </w:r>
-    </w:p>
-    <w:p>
-      <w:pPr>
-        <w:pStyle w:val="p1"/>
-      </w:pPr>
-      <w:r>
-        <w:t>Multi-runtime supervision — Claude is adapter #1, but Cursor/Windsurf/terminal jobs are next</w:t>
-      </w:r>
-    </w:p>
-    <w:p>
-      <w:pPr>
-        <w:pStyle w:val="p1"/>
-      </w:pPr>
-      <w:r>
-        <w:t>Aggregated notification view across sessions and runtimes</w:t>
-      </w:r>
-    </w:p>
-    <w:p>
-      <w:pPr>
-        <w:pStyle w:val="p1"/>
-      </w:pPr>
-      <w:r>
-        <w:t>Anthropic will always optimize for one-session-at-a-time UX. They're not building a control tower for people running multiple agents across multiple tools.</w:t>
-      </w:r>
-    </w:p>
-    <w:p>
-      <w:pPr>
-        <w:pStyle w:val="p2"/>
-      </w:pPr>
-    </w:p>
-    <w:p>
-      <w:pPr>
-        <w:pStyle w:val="p1"/>
-      </w:pPr>
-      <w:r>
-        <w:t>Answer to 6.2 and 6.3: What Anthropic Shipped (Feb 24-25, 2026)</w:t>
-      </w:r>
-    </w:p>
-    <w:p>
-      <w:pPr>
-        <w:pStyle w:val="p1"/>
-      </w:pPr>
-      <w:r>
-        <w:t>Claude Code Remote Control — almost exactly what Agent Brain does:</w:t>
-      </w:r>
-    </w:p>
-    <w:p>
-      <w:pPr>
-        <w:pStyle w:val="p1"/>
-      </w:pPr>
-      <w:r>
-        <w:t>See sessions from phone in real-time</w:t>
-      </w:r>
-    </w:p>
-    <w:p>
-      <w:pPr>
-        <w:pStyle w:val="p1"/>
-      </w:pPr>
-      <w:r>
-        <w:t>Send messages from mobile</w:t>
-      </w:r>
-    </w:p>
-    <w:p>
-      <w:pPr>
-        <w:pStyle w:val="p1"/>
-      </w:pPr>
-      <w:r>
-        <w:t>Approve/reject tool calls from mobile</w:t>
-      </w:r>
-    </w:p>
-    <w:p>
-      <w:pPr>
-        <w:pStyle w:val="p1"/>
-      </w:pPr>
-      <w:r>
-        <w:t>Multiple sessions visible in session list</w:t>
-      </w:r>
-    </w:p>
-    <w:p>
-      <w:pPr>
-        <w:pStyle w:val="p1"/>
-      </w:pPr>
-      <w:r>
-        <w:t xml:space="preserve">Requires local terminal running </w:t>
-      </w:r>
-      <w:proofErr w:type="spellStart"/>
-      <w:r>
-        <w:t>claude</w:t>
-      </w:r>
-      <w:proofErr w:type="spellEnd"/>
-      <w:r>
-        <w:t xml:space="preserve"> remote-control or /</w:t>
-      </w:r>
-      <w:proofErr w:type="spellStart"/>
-      <w:r>
-        <w:t>rc</w:t>
-      </w:r>
-      <w:proofErr w:type="spellEnd"/>
-    </w:p>
-    <w:p>
-      <w:pPr>
-        <w:pStyle w:val="p1"/>
-      </w:pPr>
-      <w:r>
-        <w:t>What Agent Brain Does That Remote Control Doesn't</w:t>
-      </w:r>
-    </w:p>
-    <w:p>
-      <w:pPr>
-        <w:pStyle w:val="p1"/>
-      </w:pPr>
-      <w:r>
-        <w:t>Today, honestly? The gap is small:</w:t>
-      </w:r>
-    </w:p>
-    <w:p>
-      <w:pPr>
-        <w:pStyle w:val="p1"/>
-      </w:pPr>
-      <w:r>
-        <w:t xml:space="preserve">No terminal required — Remote Control needs you to run </w:t>
-      </w:r>
-      <w:proofErr w:type="spellStart"/>
-      <w:r>
-        <w:t>claude</w:t>
-      </w:r>
-      <w:proofErr w:type="spellEnd"/>
-      <w:r>
-        <w:t xml:space="preserve"> remote-control in a terminal first. Agent Brain works with Claude Desktop's Code mode directly, no CLI</w:t>
-      </w:r>
-    </w:p>
-    <w:p>
-      <w:pPr>
-        <w:pStyle w:val="p1"/>
-      </w:pPr>
-      <w:r>
-        <w:t>Session adoption — we wrap existing sessions without them needing to be started in a special mode</w:t>
-      </w:r>
-    </w:p>
-    <w:p>
-      <w:pPr>
-        <w:pStyle w:val="p1"/>
-      </w:pPr>
-      <w:r>
-        <w:t>Works with Desktop app — Remote Control is CLI-only. Claude Desktop Code sessions aren't supported</w:t>
-      </w:r>
-    </w:p>
-    <w:p>
-      <w:pPr>
-        <w:pStyle w:val="p1"/>
-      </w:pPr>
-      <w:r>
-        <w:lastRenderedPageBreak/>
-        <w:t>Where there's real daylight:</w:t>
-      </w:r>
-    </w:p>
-    <w:p>
-      <w:pPr>
-        <w:pStyle w:val="p1"/>
-      </w:pPr>
-      <w:r>
-        <w:t>Cross-session attention dashboard — "what needs me right now" across all sessions. Remote Control shows a session list but no aggregated supervision view</w:t>
-      </w:r>
-    </w:p>
-    <w:p>
-      <w:pPr>
-        <w:pStyle w:val="p1"/>
-      </w:pPr>
-      <w:r>
         <w:t>Auto-approve policies — customizable governance (auto-approve safe tools, require approval for risky ones). Remote Control has no automation, you approve everything manually</w:t>
       </w:r>
     </w:p>
@@ -1684,6 +2685,126 @@
     </w:sectPr>
   </w:body>
 </w:document>
+</file>
+
+<file path=word/numbering.xml><?xml version="1.0" encoding="utf-8"?>
+<w:numbering xmlns:wpc="http://schemas.microsoft.com/office/word/2010/wordprocessingCanvas" xmlns:cx="http://schemas.microsoft.com/office/drawing/2014/chartex" xmlns:cx1="http://schemas.microsoft.com/office/drawing/2015/9/8/chartex" xmlns:cx2="http://schemas.microsoft.com/office/drawing/2015/10/21/chartex" xmlns:cx3="http://schemas.microsoft.com/office/drawing/2016/5/9/chartex" xmlns:cx4="http://schemas.microsoft.com/office/drawing/2016/5/10/chartex" xmlns:cx5="http://schemas.microsoft.com/office/drawing/2016/5/11/chartex" xmlns:cx6="http://schemas.microsoft.com/office/drawing/2016/5/12/chartex" xmlns:cx7="http://schemas.microsoft.com/office/drawing/2016/5/13/chartex" xmlns:cx8="http://schemas.microsoft.com/office/drawing/2016/5/14/chartex" xmlns:mc="http://schemas.openxmlformats.org/markup-compatibility/2006" xmlns:aink="http://schemas.microsoft.com/office/drawing/2016/ink" xmlns:am3d="http://schemas.microsoft.com/office/drawing/2017/model3d" xmlns:o="urn:schemas-microsoft-com:office:office" xmlns:oel="http://schemas.microsoft.com/office/2019/extlst" xmlns:r="http://schemas.openxmlformats.org/officeDocument/2006/relationships" xmlns:m="http://schemas.openxmlformats.org/officeDocument/2006/math" xmlns:v="urn:schemas-microsoft-com:vml" xmlns:wp14="http://schemas.microsoft.com/office/word/2010/wordprocessingDrawing" xmlns:wp="http://schemas.openxmlformats.org/drawingml/2006/wordprocessingDrawing" xmlns:w10="urn:schemas-microsoft-com:office:word" xmlns:w="http://schemas.openxmlformats.org/wordprocessingml/2006/main" xmlns:w14="http://schemas.microsoft.com/office/word/2010/wordml" xmlns:w15="http://schemas.microsoft.com/office/word/2012/wordml" xmlns:w16cex="http://schemas.microsoft.com/office/word/2018/wordml/cex" xmlns:w16cid="http://schemas.microsoft.com/office/word/2016/wordml/cid" xmlns:w16="http://schemas.microsoft.com/office/word/2018/wordml" xmlns:w16du="http://schemas.microsoft.com/office/word/2023/wordml/word16du" xmlns:w16sdtdh="http://schemas.microsoft.com/office/word/2020/wordml/sdtdatahash" xmlns:w16sdtfl="http://schemas.microsoft.com/office/word/2024/wordml/sdtformatlock" xmlns:w16se="http://schemas.microsoft.com/office/word/2015/wordml/symex" xmlns:wpg="http://schemas.microsoft.com/office/word/2010/wordprocessingGroup" xmlns:wpi="http://schemas.microsoft.com/office/word/2010/wordprocessingInk" xmlns:wne="http://schemas.microsoft.com/office/word/2006/wordml" xmlns:wps="http://schemas.microsoft.com/office/word/2010/wordprocessingShape" mc:Ignorable="w14 w15 w16se w16cid w16 w16cex w16sdtdh w16sdtfl w16du wp14">
+  <w:abstractNum w:abstractNumId="0" w15:restartNumberingAfterBreak="0">
+    <w:nsid w:val="26332B36"/>
+    <w:multiLevelType w:val="hybridMultilevel"/>
+    <w:tmpl w:val="10CCA12A"/>
+    <w:lvl w:ilvl="0" w:tplc="91669134">
+      <w:numFmt w:val="bullet"/>
+      <w:lvlText w:val="-"/>
+      <w:lvlJc w:val="left"/>
+      <w:pPr>
+        <w:ind w:left="720" w:hanging="360"/>
+      </w:pPr>
+      <w:rPr>
+        <w:rFonts w:ascii="Times New Roman" w:eastAsia="Times New Roman" w:hAnsi="Times New Roman" w:cs="Times New Roman" w:hint="default"/>
+      </w:rPr>
+    </w:lvl>
+    <w:lvl w:ilvl="1" w:tplc="04090003" w:tentative="1">
+      <w:start w:val="1"/>
+      <w:numFmt w:val="bullet"/>
+      <w:lvlText w:val="o"/>
+      <w:lvlJc w:val="left"/>
+      <w:pPr>
+        <w:ind w:left="1440" w:hanging="360"/>
+      </w:pPr>
+      <w:rPr>
+        <w:rFonts w:ascii="Courier New" w:hAnsi="Courier New" w:cs="Courier New" w:hint="default"/>
+      </w:rPr>
+    </w:lvl>
+    <w:lvl w:ilvl="2" w:tplc="04090005" w:tentative="1">
+      <w:start w:val="1"/>
+      <w:numFmt w:val="bullet"/>
+      <w:lvlText w:val=""/>
+      <w:lvlJc w:val="left"/>
+      <w:pPr>
+        <w:ind w:left="2160" w:hanging="360"/>
+      </w:pPr>
+      <w:rPr>
+        <w:rFonts w:ascii="Wingdings" w:hAnsi="Wingdings" w:hint="default"/>
+      </w:rPr>
+    </w:lvl>
+    <w:lvl w:ilvl="3" w:tplc="04090001" w:tentative="1">
+      <w:start w:val="1"/>
+      <w:numFmt w:val="bullet"/>
+      <w:lvlText w:val=""/>
+      <w:lvlJc w:val="left"/>
+      <w:pPr>
+        <w:ind w:left="2880" w:hanging="360"/>
+      </w:pPr>
+      <w:rPr>
+        <w:rFonts w:ascii="Symbol" w:hAnsi="Symbol" w:hint="default"/>
+      </w:rPr>
+    </w:lvl>
+    <w:lvl w:ilvl="4" w:tplc="04090003" w:tentative="1">
+      <w:start w:val="1"/>
+      <w:numFmt w:val="bullet"/>
+      <w:lvlText w:val="o"/>
+      <w:lvlJc w:val="left"/>
+      <w:pPr>
+        <w:ind w:left="3600" w:hanging="360"/>
+      </w:pPr>
+      <w:rPr>
+        <w:rFonts w:ascii="Courier New" w:hAnsi="Courier New" w:cs="Courier New" w:hint="default"/>
+      </w:rPr>
+    </w:lvl>
+    <w:lvl w:ilvl="5" w:tplc="04090005" w:tentative="1">
+      <w:start w:val="1"/>
+      <w:numFmt w:val="bullet"/>
+      <w:lvlText w:val=""/>
+      <w:lvlJc w:val="left"/>
+      <w:pPr>
+        <w:ind w:left="4320" w:hanging="360"/>
+      </w:pPr>
+      <w:rPr>
+        <w:rFonts w:ascii="Wingdings" w:hAnsi="Wingdings" w:hint="default"/>
+      </w:rPr>
+    </w:lvl>
+    <w:lvl w:ilvl="6" w:tplc="04090001" w:tentative="1">
+      <w:start w:val="1"/>
+      <w:numFmt w:val="bullet"/>
+      <w:lvlText w:val=""/>
+      <w:lvlJc w:val="left"/>
+      <w:pPr>
+        <w:ind w:left="5040" w:hanging="360"/>
+      </w:pPr>
+      <w:rPr>
+        <w:rFonts w:ascii="Symbol" w:hAnsi="Symbol" w:hint="default"/>
+      </w:rPr>
+    </w:lvl>
+    <w:lvl w:ilvl="7" w:tplc="04090003" w:tentative="1">
+      <w:start w:val="1"/>
+      <w:numFmt w:val="bullet"/>
+      <w:lvlText w:val="o"/>
+      <w:lvlJc w:val="left"/>
+      <w:pPr>
+        <w:ind w:left="5760" w:hanging="360"/>
+      </w:pPr>
+      <w:rPr>
+        <w:rFonts w:ascii="Courier New" w:hAnsi="Courier New" w:cs="Courier New" w:hint="default"/>
+      </w:rPr>
+    </w:lvl>
+    <w:lvl w:ilvl="8" w:tplc="04090005" w:tentative="1">
+      <w:start w:val="1"/>
+      <w:numFmt w:val="bullet"/>
+      <w:lvlText w:val=""/>
+      <w:lvlJc w:val="left"/>
+      <w:pPr>
+        <w:ind w:left="6480" w:hanging="360"/>
+      </w:pPr>
+      <w:rPr>
+        <w:rFonts w:ascii="Wingdings" w:hAnsi="Wingdings" w:hint="default"/>
+      </w:rPr>
+    </w:lvl>
+  </w:abstractNum>
+  <w:num w:numId="1" w16cid:durableId="927075450">
+    <w:abstractNumId w:val="0"/>
+  </w:num>
+</w:numbering>
 </file>
 
 <file path=word/styles.xml><?xml version="1.0" encoding="utf-8"?>
@@ -2640,6 +3761,87 @@
     <w:basedOn w:val="DefaultParagraphFont"/>
     <w:rsid w:val="00C97658"/>
   </w:style>
+  <w:style w:type="paragraph" w:styleId="HTMLPreformatted">
+    <w:name w:val="HTML Preformatted"/>
+    <w:basedOn w:val="Normal"/>
+    <w:link w:val="HTMLPreformattedChar"/>
+    <w:uiPriority w:val="99"/>
+    <w:semiHidden/>
+    <w:unhideWhenUsed/>
+    <w:rsid w:val="00EE2DC8"/>
+    <w:pPr>
+      <w:tabs>
+        <w:tab w:val="left" w:pos="916"/>
+        <w:tab w:val="left" w:pos="1832"/>
+        <w:tab w:val="left" w:pos="2748"/>
+        <w:tab w:val="left" w:pos="3664"/>
+        <w:tab w:val="left" w:pos="4580"/>
+        <w:tab w:val="left" w:pos="5496"/>
+        <w:tab w:val="left" w:pos="6412"/>
+        <w:tab w:val="left" w:pos="7328"/>
+        <w:tab w:val="left" w:pos="8244"/>
+        <w:tab w:val="left" w:pos="9160"/>
+        <w:tab w:val="left" w:pos="10076"/>
+        <w:tab w:val="left" w:pos="10992"/>
+        <w:tab w:val="left" w:pos="11908"/>
+        <w:tab w:val="left" w:pos="12824"/>
+        <w:tab w:val="left" w:pos="13740"/>
+        <w:tab w:val="left" w:pos="14656"/>
+      </w:tabs>
+      <w:spacing w:after="0" w:line="240" w:lineRule="auto"/>
+    </w:pPr>
+    <w:rPr>
+      <w:rFonts w:ascii="Courier New" w:eastAsia="Times New Roman" w:hAnsi="Courier New" w:cs="Courier New"/>
+      <w:kern w:val="0"/>
+      <w:sz w:val="20"/>
+      <w:szCs w:val="20"/>
+      <w14:ligatures w14:val="none"/>
+    </w:rPr>
+  </w:style>
+  <w:style w:type="character" w:customStyle="1" w:styleId="HTMLPreformattedChar">
+    <w:name w:val="HTML Preformatted Char"/>
+    <w:basedOn w:val="DefaultParagraphFont"/>
+    <w:link w:val="HTMLPreformatted"/>
+    <w:uiPriority w:val="99"/>
+    <w:semiHidden/>
+    <w:rsid w:val="00EE2DC8"/>
+    <w:rPr>
+      <w:rFonts w:ascii="Courier New" w:eastAsia="Times New Roman" w:hAnsi="Courier New" w:cs="Courier New"/>
+      <w:kern w:val="0"/>
+      <w:sz w:val="20"/>
+      <w:szCs w:val="20"/>
+      <w14:ligatures w14:val="none"/>
+    </w:rPr>
+  </w:style>
+  <w:style w:type="character" w:styleId="HTMLCode">
+    <w:name w:val="HTML Code"/>
+    <w:basedOn w:val="DefaultParagraphFont"/>
+    <w:uiPriority w:val="99"/>
+    <w:semiHidden/>
+    <w:unhideWhenUsed/>
+    <w:rsid w:val="00EE2DC8"/>
+    <w:rPr>
+      <w:rFonts w:ascii="Courier New" w:eastAsia="Times New Roman" w:hAnsi="Courier New" w:cs="Courier New"/>
+      <w:sz w:val="20"/>
+      <w:szCs w:val="20"/>
+    </w:rPr>
+  </w:style>
+  <w:style w:type="paragraph" w:styleId="NormalWeb">
+    <w:name w:val="Normal (Web)"/>
+    <w:basedOn w:val="Normal"/>
+    <w:uiPriority w:val="99"/>
+    <w:semiHidden/>
+    <w:unhideWhenUsed/>
+    <w:rsid w:val="00EE2DC8"/>
+    <w:pPr>
+      <w:spacing w:before="100" w:beforeAutospacing="1" w:after="100" w:afterAutospacing="1" w:line="240" w:lineRule="auto"/>
+    </w:pPr>
+    <w:rPr>
+      <w:rFonts w:ascii="Times New Roman" w:eastAsia="Times New Roman" w:hAnsi="Times New Roman" w:cs="Times New Roman"/>
+      <w:kern w:val="0"/>
+      <w14:ligatures w14:val="none"/>
+    </w:rPr>
+  </w:style>
 </w:styles>
 </file>
 

</xml_diff>